<commit_message>
Add the three documentation documents as colourful .docx
Built from build scripts kept alongside them (kit.js holds the shared look, so
the printed page uses the portal's own validated palette):

  1  Using the portal        — the four screens, the rules, a demo path,
                               and what a rejected file means
  2  Configuring the environment — every variable, where to find which one,
                               and the four that change the headline number
  3  The data model          — every table and view, how each layer is built
                               from the one below, and the dependency map

Each renders and validates; regenerate with `node doc1_portal.js` and so on.

Co-Authored-By: Claude Opus 5 <noreply@anthropic.com>
Claude-Session: https://claude.ai/code/session_01NaqcssYQoFzttrgQsf7xk1
</commit_message>
<xml_diff>
--- a/docs/docx/CCredits-1-Portal-Guide.docx
+++ b/docs/docx/CCredits-1-Portal-Guide.docx
@@ -1394,6 +1394,281 @@
         <w:t xml:space="preserve">Any column the parser recognised but did not use is listed as a note. Anything it could not read at all is a note too. Nothing is dropped silently.</w:t>
       </w:r>
     </w:p>
+    <w:p>
+      <w:pPr>
+        <w:pStyle w:val="Heading3"/>
+        <w:spacing w:after="80" w:before="190"/>
+      </w:pPr>
+      <w:r>
+        <w:rPr>
+          <w:b/>
+          <w:bCs/>
+          <w:color w:val="52514E"/>
+          <w:sz w:val="21"/>
+          <w:szCs w:val="21"/>
+        </w:rPr>
+        <w:t xml:space="preserve">If a file is rejected</w:t>
+      </w:r>
+    </w:p>
+    <w:p>
+      <w:pPr>
+        <w:spacing w:after="120" w:before="60" w:line="280"/>
+      </w:pPr>
+      <w:r>
+        <w:rPr>
+          <w:color w:val="52514E"/>
+          <w:sz w:val="20"/>
+          <w:szCs w:val="20"/>
+        </w:rPr>
+        <w:t xml:space="preserve">A rejected file says so on the upload screen, with the reason. The two you are most likely to meet:</w:t>
+      </w:r>
+    </w:p>
+    <w:tbl>
+      <w:tblPr>
+        <w:tblW w:type="dxa" w:w="9360"/>
+        <w:tblBorders>
+          <w:top w:val="single" w:color="E3E2DD" w:sz="2"/>
+          <w:left w:val="nil"/>
+          <w:bottom w:val="single" w:color="E3E2DD" w:sz="2"/>
+          <w:right w:val="nil"/>
+          <w:insideH w:val="single" w:color="E3E2DD" w:sz="2"/>
+          <w:insideV w:val="nil"/>
+        </w:tblBorders>
+      </w:tblPr>
+      <w:tblGrid>
+        <w:gridCol w:w="3182"/>
+        <w:gridCol w:w="6178"/>
+      </w:tblGrid>
+      <w:tr>
+        <w:trPr>
+          <w:tblHeader/>
+        </w:trPr>
+        <w:tc>
+          <w:tcPr>
+            <w:tcW w:type="dxa" w:w="3182"/>
+            <w:shd w:fill="D03B3B" w:val="clear"/>
+            <w:tcMar>
+              <w:top w:type="dxa" w:w="90"/>
+              <w:left w:type="dxa" w:w="120"/>
+              <w:bottom w:type="dxa" w:w="90"/>
+              <w:right w:type="dxa" w:w="120"/>
+            </w:tcMar>
+          </w:tcPr>
+          <w:p>
+            <w:pPr>
+              <w:spacing w:after="0" w:before="0"/>
+            </w:pPr>
+            <w:r>
+              <w:rPr>
+                <w:b/>
+                <w:bCs/>
+                <w:color w:val="FFFFFF"/>
+                <w:spacing w:val="20"/>
+                <w:sz w:val="17"/>
+                <w:szCs w:val="17"/>
+              </w:rPr>
+              <w:t xml:space="preserve">What it says</w:t>
+            </w:r>
+          </w:p>
+        </w:tc>
+        <w:tc>
+          <w:tcPr>
+            <w:tcW w:type="dxa" w:w="6178"/>
+            <w:shd w:fill="D03B3B" w:val="clear"/>
+            <w:tcMar>
+              <w:top w:type="dxa" w:w="90"/>
+              <w:left w:type="dxa" w:w="120"/>
+              <w:bottom w:type="dxa" w:w="90"/>
+              <w:right w:type="dxa" w:w="120"/>
+            </w:tcMar>
+          </w:tcPr>
+          <w:p>
+            <w:pPr>
+              <w:spacing w:after="0" w:before="0"/>
+            </w:pPr>
+            <w:r>
+              <w:rPr>
+                <w:b/>
+                <w:bCs/>
+                <w:color w:val="FFFFFF"/>
+                <w:spacing w:val="20"/>
+                <w:sz w:val="17"/>
+                <w:szCs w:val="17"/>
+              </w:rPr>
+              <w:t xml:space="preserve">What it means</w:t>
+            </w:r>
+          </w:p>
+        </w:tc>
+      </w:tr>
+      <w:tr>
+        <w:tc>
+          <w:tcPr>
+            <w:tcW w:type="dxa" w:w="3182"/>
+            <w:shd w:fill="F7F7F5" w:val="clear"/>
+            <w:tcMar>
+              <w:top w:type="dxa" w:w="90"/>
+              <w:left w:type="dxa" w:w="120"/>
+              <w:bottom w:type="dxa" w:w="90"/>
+              <w:right w:type="dxa" w:w="120"/>
+            </w:tcMar>
+          </w:tcPr>
+          <w:p>
+            <w:pPr>
+              <w:spacing w:after="0" w:before="0" w:line="260"/>
+            </w:pPr>
+            <w:r>
+              <w:rPr>
+                <w:color w:val="52514E"/>
+                <w:sz w:val="18"/>
+                <w:szCs w:val="18"/>
+              </w:rPr>
+              <w:t xml:space="preserve">No sheet had a header this parser recognised</w:t>
+            </w:r>
+          </w:p>
+        </w:tc>
+        <w:tc>
+          <w:tcPr>
+            <w:tcW w:type="dxa" w:w="6178"/>
+            <w:shd w:fill="F7F7F5" w:val="clear"/>
+            <w:tcMar>
+              <w:top w:type="dxa" w:w="90"/>
+              <w:left w:type="dxa" w:w="120"/>
+              <w:bottom w:type="dxa" w:w="90"/>
+              <w:right w:type="dxa" w:w="120"/>
+            </w:tcMar>
+          </w:tcPr>
+          <w:p>
+            <w:pPr>
+              <w:spacing w:after="0" w:before="0" w:line="260"/>
+            </w:pPr>
+            <w:r>
+              <w:rPr>
+                <w:color w:val="52514E"/>
+                <w:sz w:val="18"/>
+                <w:szCs w:val="18"/>
+              </w:rPr>
+              <w:t xml:space="preserve">The sheet was read but no header row was found. The parser looks past a logo row and a title row, so this usually means the export is a shape it has not seen — send the file on rather than editing it by hand.</w:t>
+            </w:r>
+          </w:p>
+        </w:tc>
+      </w:tr>
+      <w:tr>
+        <w:tc>
+          <w:tcPr>
+            <w:tcW w:type="dxa" w:w="3182"/>
+            <w:shd w:fill="FFFFFF" w:val="clear"/>
+            <w:tcMar>
+              <w:top w:type="dxa" w:w="90"/>
+              <w:left w:type="dxa" w:w="120"/>
+              <w:bottom w:type="dxa" w:w="90"/>
+              <w:right w:type="dxa" w:w="120"/>
+            </w:tcMar>
+          </w:tcPr>
+          <w:p>
+            <w:pPr>
+              <w:spacing w:after="0" w:before="0" w:line="260"/>
+            </w:pPr>
+            <w:r>
+              <w:rPr>
+                <w:color w:val="52514E"/>
+                <w:sz w:val="18"/>
+                <w:szCs w:val="18"/>
+              </w:rPr>
+              <w:t xml:space="preserve">Sheet could not be read / Could not open the file</w:t>
+            </w:r>
+          </w:p>
+        </w:tc>
+        <w:tc>
+          <w:tcPr>
+            <w:tcW w:type="dxa" w:w="6178"/>
+            <w:shd w:fill="FFFFFF" w:val="clear"/>
+            <w:tcMar>
+              <w:top w:type="dxa" w:w="90"/>
+              <w:left w:type="dxa" w:w="120"/>
+              <w:bottom w:type="dxa" w:w="90"/>
+              <w:right w:type="dxa" w:w="120"/>
+            </w:tcMar>
+          </w:tcPr>
+          <w:p>
+            <w:pPr>
+              <w:spacing w:after="0" w:before="0" w:line="260"/>
+            </w:pPr>
+            <w:r>
+              <w:rPr>
+                <w:color w:val="52514E"/>
+                <w:sz w:val="18"/>
+                <w:szCs w:val="18"/>
+              </w:rPr>
+              <w:t xml:space="preserve">The workbook itself is damaged, or is not really a spreadsheet despite the extension.</w:t>
+            </w:r>
+          </w:p>
+        </w:tc>
+      </w:tr>
+    </w:tbl>
+    <w:p>
+      <w:pPr>
+        <w:spacing w:after="60"/>
+      </w:pPr>
+    </w:p>
+    <w:tbl>
+      <w:tblPr>
+        <w:tblW w:type="dxa" w:w="9360"/>
+        <w:tblBorders>
+          <w:top w:val="single" w:color="auto" w:sz="4"/>
+          <w:left w:val="single" w:color="auto" w:sz="4"/>
+          <w:bottom w:val="single" w:color="auto" w:sz="4"/>
+          <w:right w:val="single" w:color="auto" w:sz="4"/>
+          <w:insideH w:val="single" w:color="auto" w:sz="4"/>
+          <w:insideV w:val="single" w:color="auto" w:sz="4"/>
+        </w:tblBorders>
+      </w:tblPr>
+      <w:tblGrid>
+        <w:gridCol w:w="9360"/>
+      </w:tblGrid>
+      <w:tr>
+        <w:tc>
+          <w:tcPr>
+            <w:tcW w:type="dxa" w:w="9360"/>
+            <w:tcBorders>
+              <w:top w:val="nil"/>
+              <w:left w:val="single" w:color="D03B3B" w:sz="18"/>
+              <w:bottom w:val="nil"/>
+              <w:right w:val="nil"/>
+            </w:tcBorders>
+            <w:shd w:fill="FBEAEA" w:val="clear"/>
+            <w:tcMar>
+              <w:top w:type="dxa" w:w="140"/>
+              <w:left w:type="dxa" w:w="180"/>
+              <w:bottom w:type="dxa" w:w="140"/>
+              <w:right w:type="dxa" w:w="180"/>
+            </w:tcMar>
+          </w:tcPr>
+          <w:p>
+            <w:pPr>
+              <w:spacing w:line="280"/>
+            </w:pPr>
+            <w:r>
+              <w:rPr>
+                <w:b/>
+                <w:bCs/>
+                <w:color w:val="D03B3B"/>
+                <w:sz w:val="20"/>
+                <w:szCs w:val="20"/>
+              </w:rPr>
+              <w:t xml:space="preserve">Do not "fix" an export by hand before uploading.  </w:t>
+            </w:r>
+            <w:r>
+              <w:rPr>
+                <w:color w:val="52514E"/>
+                <w:sz w:val="20"/>
+                <w:szCs w:val="20"/>
+              </w:rPr>
+              <w:t xml:space="preserve">Deleting the preamble rows or renaming a column breaks the link between the number and the file it came from, which is the whole point of the lineage. If a file is rejected, the parser should learn to read it.</w:t>
+            </w:r>
+          </w:p>
+        </w:tc>
+      </w:tr>
+    </w:tbl>
     <w:p>
       <w:pPr>
         <w:pStyle w:val="Heading3"/>

</xml_diff>